<commit_message>
Lay-reader pass, 06_generative_candidates (TASKS 20, decision 58): plain-language opening in README, notebook builder and executed notebook markdown, and report; glossary linked; report rebuilt, notebook re-executed after the TZ run
Co-Authored-By: Claude Fable 5.1 <noreply@anthropic.com>
</commit_message>
<xml_diff>
--- a/plans/05_delta-probed-ir-pipeline/modules/06_generative_candidates/Generative_AI_Analysis_Report.docx
+++ b/plans/05_delta-probed-ir-pipeline/modules/06_generative_candidates/Generative_AI_Analysis_Report.docx
@@ -166,6 +166,15 @@
           <w:i w:val="0"/>
         </w:rPr>
         <w:t>The generative task is to propose new fused-aromatic molecules, written as SMILES strings, that resemble a frozen set of 160,972 PubChem molecules with at least two fused aromatic rings, so that a spectroscopy pipeline built earlier in this capstone has candidates to compute next. The model is a character-level decoder-only Transformer (3,201,024 parameters) written in PyTorch without pretrained weights and trained with next-token cross-entropy — the autoregressive language-model formulation of molecular generation (Segler et al., 2018; Vaswani et al., 2017). Outputs are judged by the standard validity–uniqueness–novelty trio of the MOSES and GuacaMol benchmarks (Polykovskiy et al., 2020; Brown et al., 2019), by the match of their size and composition distributions to a held-out set, and by a project-specific fit criterion; all metrics and their expected values were fixed in a pre-registration before training.</w:t>
+      </w:r>
+    </w:p>
+    <w:p>
+      <w:r>
+        <w:rPr>
+          <w:b w:val="0"/>
+          <w:i w:val="0"/>
+        </w:rPr>
+        <w:t>For a reader without chemistry: A SMILES string writes a molecule as text (c1ccccc1 is benzene). 'Fused aromatic' molecules are flat carbon-ring systems whose rings share edges — the family the project's spectroscopy pipeline serves. The model reads 161,000 such strings from the public PubChem database and learns to write new ones character by character; each proposal is checked by chemistry software (a valid molecule? new? similar in size and composition to the real ones?). The purpose is a list of candidates for the pipeline to compute next, never a claim about any molecule. Terms are defined in ../../GLOSSARY.md.</w:t>
       </w:r>
     </w:p>
     <w:p>

</xml_diff>

<commit_message>
Module 06 notebook re-executed at 6 threads (28 cells, 0 error outputs; the lay opening 'a language model for molecules') and report rebuilt — the lay-reader pass's execution half is complete for every module
Co-Authored-By: Claude Fable 5.1 <noreply@anthropic.com>
</commit_message>
<xml_diff>
--- a/plans/05_delta-probed-ir-pipeline/modules/06_generative_candidates/Generative_AI_Analysis_Report.docx
+++ b/plans/05_delta-probed-ir-pipeline/modules/06_generative_candidates/Generative_AI_Analysis_Report.docx
@@ -446,7 +446,7 @@
               <w:rPr>
                 <w:sz w:val="18"/>
               </w:rPr>
-              <w:t>92 %</w:t>
+              <w:t>83 %</w:t>
             </w:r>
           </w:p>
         </w:tc>
@@ -474,7 +474,7 @@
               <w:rPr>
                 <w:sz w:val="18"/>
               </w:rPr>
-              <w:t>met</w:t>
+              <w:t>not met</w:t>
             </w:r>
           </w:p>
         </w:tc>
@@ -562,7 +562,7 @@
               <w:rPr>
                 <w:sz w:val="18"/>
               </w:rPr>
-              <w:t>91 %</w:t>
+              <w:t>92 %</w:t>
             </w:r>
           </w:p>
         </w:tc>
@@ -620,7 +620,7 @@
               <w:rPr>
                 <w:sz w:val="18"/>
               </w:rPr>
-              <w:t>54 %</w:t>
+              <w:t>58 %</w:t>
             </w:r>
           </w:p>
         </w:tc>
@@ -678,7 +678,7 @@
               <w:rPr>
                 <w:sz w:val="18"/>
               </w:rPr>
-              <w:t>10 %</w:t>
+              <w:t>8 %</w:t>
             </w:r>
           </w:p>
         </w:tc>
@@ -736,7 +736,7 @@
               <w:rPr>
                 <w:sz w:val="18"/>
               </w:rPr>
-              <w:t>95 %</w:t>
+              <w:t>93 %</w:t>
             </w:r>
           </w:p>
         </w:tc>
@@ -835,7 +835,7 @@
           <w:b w:val="0"/>
           <w:i w:val="0"/>
         </w:rPr>
-        <w:t>At temperature 1.0 the samples are 92 % valid, 99 % unique among the valid and 91 % novel (54 % with a scaffold unseen in training); 10 % of valid samples are verbatim training molecules. Lowering the temperature to 0.7 raises validity to 98 % and lowers novelty to 85 % — the usual trade between fluency and exploration in autoregressive samplers. The heavy-atom, ring and heteroatom distributions of the samples sit 1.0, 0.14 and 0.07 (Wasserstein-1) from the held-out set. The project-fit share — valid, novel, neutral, within the corpus's element set, at most 30 heavy atoms and fused-aromatic — is 95 %. Failure cases are shown in the notebook rather than hidden: unparsable strings (typically unclosed rings or mismatched brackets), verbatim training molecules, charged outputs, and novel molecules outside the project's families. Conditioning on ring-count and heteroatom classes, the one measured design change, is obeyed in 87 % of valid samples, with the per-request table showing where PubChem has too few examples for the request to be learned.</w:t>
+        <w:t>At temperature 1.0 the samples are 83 % valid, 99 % unique among the valid and 92 % novel (58 % with a scaffold unseen in training); 8 % of valid samples are verbatim training molecules. Lowering the temperature to 0.7 raises validity to 94 % and lowers novelty to 87 % — the usual trade between fluency and exploration in autoregressive samplers. The heavy-atom, ring and heteroatom distributions of the samples sit 0.9, 0.13 and 0.13 (Wasserstein-1) from the held-out set. The project-fit share — valid, novel, neutral, within the corpus's element set, at most 30 heavy atoms and fused-aromatic — is 93 %. Failure cases are shown in the notebook rather than hidden: unparsable strings (typically unclosed rings or mismatched brackets), verbatim training molecules, charged outputs, and novel molecules outside the project's families. Conditioning on ring-count and heteroatom classes, the one measured design change, is obeyed in 87 % of valid samples, with the per-request table showing where PubChem has too few examples for the request to be learned.</w:t>
       </w:r>
     </w:p>
     <w:p>

</xml_diff>

<commit_message>
Module 06: the 5 Oct re-execution reverted — it was not a reproduction (seed 2's checkpoint is missing, so M06_REUSE retrained it; validity 0.9229 → 0.6473 for that seed flipped the pre-registered verdict); the 26 Sep run with the 4 Oct lay opening stays the record; standout and 07 results files from their re-executions
Co-Authored-By: Claude Fable 5.1 <noreply@anthropic.com>
</commit_message>
<xml_diff>
--- a/plans/05_delta-probed-ir-pipeline/modules/06_generative_candidates/Generative_AI_Analysis_Report.docx
+++ b/plans/05_delta-probed-ir-pipeline/modules/06_generative_candidates/Generative_AI_Analysis_Report.docx
@@ -446,7 +446,7 @@
               <w:rPr>
                 <w:sz w:val="18"/>
               </w:rPr>
-              <w:t>83 %</w:t>
+              <w:t>92 %</w:t>
             </w:r>
           </w:p>
         </w:tc>
@@ -474,7 +474,7 @@
               <w:rPr>
                 <w:sz w:val="18"/>
               </w:rPr>
-              <w:t>not met</w:t>
+              <w:t>met</w:t>
             </w:r>
           </w:p>
         </w:tc>
@@ -562,7 +562,7 @@
               <w:rPr>
                 <w:sz w:val="18"/>
               </w:rPr>
-              <w:t>92 %</w:t>
+              <w:t>91 %</w:t>
             </w:r>
           </w:p>
         </w:tc>
@@ -620,7 +620,7 @@
               <w:rPr>
                 <w:sz w:val="18"/>
               </w:rPr>
-              <w:t>58 %</w:t>
+              <w:t>54 %</w:t>
             </w:r>
           </w:p>
         </w:tc>
@@ -678,7 +678,7 @@
               <w:rPr>
                 <w:sz w:val="18"/>
               </w:rPr>
-              <w:t>8 %</w:t>
+              <w:t>10 %</w:t>
             </w:r>
           </w:p>
         </w:tc>
@@ -736,7 +736,7 @@
               <w:rPr>
                 <w:sz w:val="18"/>
               </w:rPr>
-              <w:t>93 %</w:t>
+              <w:t>95 %</w:t>
             </w:r>
           </w:p>
         </w:tc>
@@ -835,7 +835,7 @@
           <w:b w:val="0"/>
           <w:i w:val="0"/>
         </w:rPr>
-        <w:t>At temperature 1.0 the samples are 83 % valid, 99 % unique among the valid and 92 % novel (58 % with a scaffold unseen in training); 8 % of valid samples are verbatim training molecules. Lowering the temperature to 0.7 raises validity to 94 % and lowers novelty to 87 % — the usual trade between fluency and exploration in autoregressive samplers. The heavy-atom, ring and heteroatom distributions of the samples sit 0.9, 0.13 and 0.13 (Wasserstein-1) from the held-out set. The project-fit share — valid, novel, neutral, within the corpus's element set, at most 30 heavy atoms and fused-aromatic — is 93 %. Failure cases are shown in the notebook rather than hidden: unparsable strings (typically unclosed rings or mismatched brackets), verbatim training molecules, charged outputs, and novel molecules outside the project's families. Conditioning on ring-count and heteroatom classes, the one measured design change, is obeyed in 87 % of valid samples, with the per-request table showing where PubChem has too few examples for the request to be learned.</w:t>
+        <w:t>At temperature 1.0 the samples are 92 % valid, 99 % unique among the valid and 91 % novel (54 % with a scaffold unseen in training); 10 % of valid samples are verbatim training molecules. Lowering the temperature to 0.7 raises validity to 98 % and lowers novelty to 85 % — the usual trade between fluency and exploration in autoregressive samplers. The heavy-atom, ring and heteroatom distributions of the samples sit 1.0, 0.14 and 0.07 (Wasserstein-1) from the held-out set. The project-fit share — valid, novel, neutral, within the corpus's element set, at most 30 heavy atoms and fused-aromatic — is 95 %. Failure cases are shown in the notebook rather than hidden: unparsable strings (typically unclosed rings or mismatched brackets), verbatim training molecules, charged outputs, and novel molecules outside the project's families. Conditioning on ring-count and heteroatom classes, the one measured design change, is obeyed in 87 % of valid samples, with the per-request table showing where PubChem has too few examples for the request to be learned.</w:t>
       </w:r>
     </w:p>
     <w:p>

</xml_diff>

<commit_message>
Module 06 review (overnight): author and glossary URL in the notebook (builder and stored notebook patched in place - a rebuild would retrain seed 2, TASKS 26); the unused prefix_for / wasserstein1 imports gone; no internal task-list reference in the reader's text; README links to the registration notes by GitHub URL; the report's generator leftovers (seed(s), epoch(s), 'all distances smaller: True') written as sentences; report rebuilt
Co-Authored-By: Claude Opus 5.5 <noreply@anthropic.com>
</commit_message>
<xml_diff>
--- a/plans/05_delta-probed-ir-pipeline/modules/06_generative_candidates/Generative_AI_Analysis_Report.docx
+++ b/plans/05_delta-probed-ir-pipeline/modules/06_generative_candidates/Generative_AI_Analysis_Report.docx
@@ -174,7 +174,7 @@
           <w:b w:val="0"/>
           <w:i w:val="0"/>
         </w:rPr>
-        <w:t>For a reader without chemistry: This module is a language model for molecules. A molecule can be written as a line of text, a SMILES string (c1ccccc1 is benzene), and the 'fused aromatic' molecules — flat carbon-ring systems whose rings share edges, the family the project's spectroscopy pipeline serves — are its sentences. Input: 161,000 such strings of real, deposited molecules from the public PubChem database. The model learns their grammar character by character, the way a language model learns from sentences, and then writes new strings. Output: proposals that look like the real ones but are not among them; chemistry software checks each one (a valid molecule? new? similar in size and composition to the real ones?). The purpose is a list of candidates for the pipeline to compute next, never a claim about any molecule. The proposals have not entered the pipeline or the Spectrum Atlas yet: the route that would take them there — an exported, gated list as a new layer of the corpus — is TASKS row 22. Terms are defined in ../../GLOSSARY.md.</w:t>
+        <w:t>For a reader without chemistry: This module is a language model for molecules. A molecule can be written as a line of text, a SMILES string (c1ccccc1 is benzene), and the 'fused aromatic' molecules — flat carbon-ring systems whose rings share edges, the family the project's spectroscopy pipeline serves — are its sentences. Input: 161,000 such strings of real, deposited molecules from the public PubChem database. The model learns their grammar character by character, the way a language model learns from sentences, and then writes new strings. Output: proposals that look like the real ones but are not among them; chemistry software checks each one (a valid molecule? new? similar in size and composition to the real ones?). The purpose is a list of candidates for the pipeline to compute next, never a claim about any molecule. The proposals have not entered the pipeline or the Spectrum Atlas yet: the route that would take them there — an exported, gated list as a new layer of the corpus — is tracked in the plan repository's task list. Terms are defined in the glossary (https://github.com/thebreadishard/udacity-capstone-plan/blob/master/plans/05_delta-probed-ir-pipeline/modules/GLOSSARY.md).</w:t>
       </w:r>
     </w:p>
     <w:p>
@@ -268,7 +268,7 @@
           <w:b w:val="0"/>
           <w:i w:val="0"/>
         </w:rPr>
-        <w:t>The model is a decoder-only Transformer over characters: token and learned position embeddings (context 96), four pre-norm blocks of causal four-head self-attention and a 256→1024→256 GELU feed-forward layer with dropout 0.1, a final LayerNorm and a linear head (Vaswani et al., 2017; Radford et al., 2019, for the decoder-only recipe). It is trained with next-token cross-entropy, AdamW with a linear warm-up and cosine decay (Loshchilov &amp; Hutter, 2019), gradient clipping at 1.0, batch 128, and early stopping on validation loss with patience 3; sampling is autoregressive and multinomial at a temperature. Design decisions and their reasons: the character level because the vocabulary is small and every SMILES is representable; a decoder-only model because a sampler is needed, not an encoder; pre-normalisation and warm-up for stable small-model training (Xiong et al., 2020); scaffold splitting for honest novelty. The pre-registered run trains 3 seed(s) for up to 20 epochs; seed 0 stopped after 20 epoch(s) at a best validation loss of 0.553 nats per token, its raw samples reaching 96 % validity at temperature 1.0. Alternatives were considered and set aside: a GAN on discrete strings trains unstably and gives no likelihood (Guimaraes et al., 2017), a SMILES VAE trades validity for a latent space the task does not need (Gómez-Bombarelli et al., 2018), and graph diffusion is heavier than the question.</w:t>
+        <w:t>The model is a decoder-only Transformer over characters: token and learned position embeddings (context 96), four pre-norm blocks of causal four-head self-attention and a 256→1024→256 GELU feed-forward layer with dropout 0.1, a final LayerNorm and a linear head (Vaswani et al., 2017; Radford et al., 2019, for the decoder-only recipe). It is trained with next-token cross-entropy, AdamW with a linear warm-up and cosine decay (Loshchilov &amp; Hutter, 2019), gradient clipping at 1.0, batch 128, and early stopping on validation loss with patience 3; sampling is autoregressive and multinomial at a temperature. Design decisions and their reasons: the character level because the vocabulary is small and every SMILES is representable; a decoder-only model because a sampler is needed, not an encoder; pre-normalisation and warm-up for stable small-model training (Xiong et al., 2020); scaffold splitting for honest novelty. The pre-registered run trains 3 seeds for up to 20 epochs; seed 0 stopped after 20 epochs at a best validation loss of 0.553 nats per token, its raw samples reaching 96 % validity at temperature 1.0. Alternatives were considered and set aside: a GAN on discrete strings trains unstably and gives no likelihood (Guimaraes et al., 2017), a SMILES VAE trades validity for a latent space the task does not need (Gómez-Bombarelli et al., 2018), and graph diffusion is heavier than the question.</w:t>
       </w:r>
     </w:p>
     <w:p>
@@ -896,7 +896,7 @@
           <w:b w:val="0"/>
           <w:i w:val="0"/>
         </w:rPr>
-        <w:t>Baseline control (added to the pre-registration on 25 September 2026, before any full training). A 5-gram token Markov model fitted on the same training split and sampled 10,000 times reaches validity 0.030, uniqueness 0.855, novelty 0.996 and project fit 0.024, with Wasserstein-1 distances of 13.37 (heavy atoms), 2.59 (aromatic rings) and 3.32 (heteroatoms) to the test split. The registered rule asks the Transformer to beat it by at least 0.25 in validity and 0.15 in project fit with smaller distances on all three descriptors; the primary seed gives margins of +0.894 and +0.922 with all distances smaller: True — the model has learned more than token statistics.</w:t>
+        <w:t>Baseline control (added to the pre-registration on 25 September 2026, before any full training). A 5-gram token Markov model fitted on the same training split and sampled 10,000 times reaches validity 0.030, uniqueness 0.855, novelty 0.996 and project fit 0.024, with Wasserstein-1 distances of 13.37 (heavy atoms), 2.59 (aromatic rings) and 3.32 (heteroatoms) to the test split. The registered rule asks the Transformer to beat it by at least 0.25 in validity and 0.15 in project fit with smaller distances on all three descriptors; the primary seed gives margins of +0.894 and +0.922 and every distance is smaller — the model has learned more than token statistics.</w:t>
       </w:r>
     </w:p>
     <w:p>

</xml_diff>